<commit_message>
Asistente guiado con botones para crear contratos desde el chat
El arrendador envía la foto de la cédula del arrendatario (Claude la lee) y elige
inmueble, precio, canon (depósito), duración y fecha de inicio con botones que
sugieren lo usado antes. Las direcciones y valores se guardan en un catálogo
persistente. Reemplaza el agente conversacional por un flujo determinista y
restringe el bot a usuarios autorizados.

Co-Authored-By: Claude Opus 5.5 <noreply@anthropic.com>
</commit_message>
<xml_diff>
--- a/templates/contrato-arrendamiento.docx
+++ b/templates/contrato-arrendamiento.docx
@@ -34,7 +34,7 @@
         <w:t xml:space="preserve">Primera. – Objeto: </w:t>
       </w:r>
       <w:r>
-        <w:t>Por medio del presente contrato, EL ARRENDADOR entrega a título de arrendamiento a EL ARRENDATARIO el siguiente bien inmueble: Carrera 105 i 67 d 31 apto {apartamento}, destinado para el uso de vivienda para {ocupantes_texto}. LINDEROS: Se plasmarán en documento anexo que hará parte del contrato.</w:t>
+        <w:t>Por medio del presente contrato, EL ARRENDADOR entrega a título de arrendamiento a EL ARRENDATARIO el siguiente bien inmueble: {inmueble_direccion}, destinado para el uso de vivienda para {ocupantes_texto}. LINDEROS: Se plasmarán en documento anexo que hará parte del contrato.</w:t>
       </w:r>
     </w:p>
     <w:p>
@@ -48,7 +48,7 @@
         <w:t xml:space="preserve">Segunda. – Canon de Arrendamiento: </w:t>
       </w:r>
       <w:r>
-        <w:t>El canon de arrendamiento mensual es la suma de {canon_texto} M/cte, que EL ARRENDATARIO pagará anticipadamente al ARRENDADOR o a su orden, en el domicilio de EL ARRENDADOR ubicado en la Carrera 105 H 67 D 33, dentro de los primeros cinco (5) días de cada mes. Cada doce (12) meses el canon de arrendamiento será reajustado en el porcentaje máximo correspondiente al IPC del año inmediatamente anterior.</w:t>
+        <w:t>El canon de arrendamiento mensual es la suma de {precio_texto} M/cte, que EL ARRENDATARIO pagará anticipadamente al ARRENDADOR o a su orden, en el domicilio de EL ARRENDADOR ubicado en la Carrera 105 H 67 D 33, dentro de los primeros cinco (5) días de cada mes. Cada doce (12) meses el canon de arrendamiento será reajustado en el porcentaje máximo correspondiente al IPC del año inmediatamente anterior.</w:t>
       </w:r>
     </w:p>
     <w:p>
@@ -63,6 +63,36 @@
       </w:r>
       <w:r>
         <w:t>La tolerancia de EL ARRENDADOR en recibir el pago del canon de arrendamiento con posterioridad al plazo indicado para ello en esta Cláusula no podrá entenderse, en ningún caso, como ánimo de EL ARRENDADOR de modificar el término establecido en este Contrato para el pago del canon.</w:t>
+      </w:r>
+    </w:p>
+    <w:p>
+      <w:pPr>
+        <w:jc w:val="both"/>
+      </w:pPr>
+      <w:r>
+        <w:t>{#hay_deposito}</w:t>
+      </w:r>
+    </w:p>
+    <w:p>
+      <w:pPr>
+        <w:jc w:val="both"/>
+      </w:pPr>
+      <w:r>
+        <w:rPr>
+          <w:b/>
+        </w:rPr>
+        <w:t xml:space="preserve">Parágrafo 2: </w:t>
+      </w:r>
+      <w:r>
+        <w:t>A la firma del presente Contrato, EL ARRENDATARIO entrega a EL ARRENDADOR la suma de {deposito_texto} M/cte, a título de depósito, para cubrir los daños al inmueble, los servicios públicos y demás obligaciones pendientes a cargo de EL ARRENDATARIO a la fecha de restitución del Inmueble. El saldo, si lo hubiere, será devuelto a EL ARRENDATARIO una vez restituido el Inmueble y verificado el pago de dichas obligaciones.</w:t>
+      </w:r>
+    </w:p>
+    <w:p>
+      <w:pPr>
+        <w:jc w:val="both"/>
+      </w:pPr>
+      <w:r>
+        <w:t>{/hay_deposito}</w:t>
       </w:r>
     </w:p>
     <w:p>

</xml_diff>

<commit_message>
Plantilla: mantener firmas y notificaciones en una sola página
El bloque de cierre ("Para constancia" + firmas) y la tabla de notificaciones
se partían entre páginas. Ahora usan keep-with-next y filas que no se dividen:
si no caben, pasan completos a la página siguiente.

Co-Authored-By: Claude Opus 5.5 <noreply@anthropic.com>
</commit_message>
<xml_diff>
--- a/templates/contrato-arrendamiento.docx
+++ b/templates/contrato-arrendamiento.docx
@@ -644,12 +644,17 @@
         <w:gridCol w:w="4703"/>
       </w:tblGrid>
       <w:tr>
+        <w:trPr>
+          <w:cantSplit/>
+        </w:trPr>
         <w:tc>
           <w:tcPr>
             <w:tcW w:type="dxa" w:w="4703"/>
           </w:tcPr>
           <w:p>
             <w:pPr>
+              <w:keepNext/>
+              <w:keepLines/>
               <w:spacing w:after="40"/>
             </w:pPr>
             <w:r/>
@@ -667,6 +672,8 @@
           </w:tcPr>
           <w:p>
             <w:pPr>
+              <w:keepNext/>
+              <w:keepLines/>
               <w:spacing w:after="40"/>
             </w:pPr>
             <w:r/>
@@ -680,12 +687,17 @@
         </w:tc>
       </w:tr>
       <w:tr>
+        <w:trPr>
+          <w:cantSplit/>
+        </w:trPr>
         <w:tc>
           <w:tcPr>
             <w:tcW w:type="dxa" w:w="4703"/>
           </w:tcPr>
           <w:p>
             <w:pPr>
+              <w:keepNext/>
+              <w:keepLines/>
               <w:spacing w:after="40"/>
             </w:pPr>
             <w:r/>
@@ -698,6 +710,8 @@
           </w:p>
           <w:p>
             <w:pPr>
+              <w:keepNext/>
+              <w:keepLines/>
               <w:spacing w:after="40"/>
             </w:pPr>
             <w:r>
@@ -714,6 +728,8 @@
           </w:tcPr>
           <w:p>
             <w:pPr>
+              <w:keepNext/>
+              <w:keepLines/>
               <w:spacing w:after="40"/>
             </w:pPr>
             <w:r/>
@@ -726,6 +742,8 @@
           </w:p>
           <w:p>
             <w:pPr>
+              <w:keepNext/>
+              <w:keepLines/>
               <w:spacing w:after="40"/>
             </w:pPr>
             <w:r>
@@ -738,12 +756,17 @@
         </w:tc>
       </w:tr>
       <w:tr>
+        <w:trPr>
+          <w:cantSplit/>
+        </w:trPr>
         <w:tc>
           <w:tcPr>
             <w:tcW w:type="dxa" w:w="4703"/>
           </w:tcPr>
           <w:p>
             <w:pPr>
+              <w:keepNext/>
+              <w:keepLines/>
               <w:spacing w:after="40"/>
             </w:pPr>
             <w:r/>
@@ -761,6 +784,8 @@
           </w:tcPr>
           <w:p>
             <w:pPr>
+              <w:keepNext/>
+              <w:keepLines/>
               <w:spacing w:after="40"/>
             </w:pPr>
             <w:r/>
@@ -774,12 +799,17 @@
         </w:tc>
       </w:tr>
       <w:tr>
+        <w:trPr>
+          <w:cantSplit/>
+        </w:trPr>
         <w:tc>
           <w:tcPr>
             <w:tcW w:type="dxa" w:w="4703"/>
           </w:tcPr>
           <w:p>
             <w:pPr>
+              <w:keepNext w:val="0"/>
+              <w:keepLines/>
               <w:spacing w:after="40"/>
             </w:pPr>
             <w:r/>
@@ -797,6 +827,8 @@
           </w:tcPr>
           <w:p>
             <w:pPr>
+              <w:keepNext w:val="0"/>
+              <w:keepLines/>
               <w:spacing w:after="40"/>
             </w:pPr>
             <w:r/>
@@ -813,14 +845,24 @@
     <w:p/>
     <w:p>
       <w:pPr>
+        <w:keepNext/>
+        <w:keepLines/>
         <w:jc w:val="both"/>
       </w:pPr>
       <w:r>
         <w:t>Para constancia, el presente Contrato es suscrito en la ciudad de Bogotá, en {ejemplares_texto} ejemplares de igual valor, cada uno de ellos con destino a cada una de las partes.</w:t>
       </w:r>
     </w:p>
-    <w:p/>
-    <w:p/>
+    <w:p>
+      <w:pPr>
+        <w:keepNext/>
+      </w:pPr>
+    </w:p>
+    <w:p>
+      <w:pPr>
+        <w:keepNext/>
+      </w:pPr>
+    </w:p>
     <w:tbl>
       <w:tblPr>
         <w:tblW w:type="auto" w:w="0"/>
@@ -832,12 +874,17 @@
         <w:gridCol w:w="4703"/>
       </w:tblGrid>
       <w:tr>
+        <w:trPr>
+          <w:cantSplit/>
+        </w:trPr>
         <w:tc>
           <w:tcPr>
             <w:tcW w:type="dxa" w:w="4703"/>
           </w:tcPr>
           <w:p>
             <w:pPr>
+              <w:keepNext/>
+              <w:keepLines/>
               <w:spacing w:after="0"/>
             </w:pPr>
             <w:r>
@@ -854,6 +901,8 @@
           </w:tcPr>
           <w:p>
             <w:pPr>
+              <w:keepNext/>
+              <w:keepLines/>
               <w:spacing w:after="0"/>
             </w:pPr>
             <w:r>
@@ -866,12 +915,17 @@
         </w:tc>
       </w:tr>
       <w:tr>
+        <w:trPr>
+          <w:cantSplit/>
+        </w:trPr>
         <w:tc>
           <w:tcPr>
             <w:tcW w:type="dxa" w:w="4703"/>
           </w:tcPr>
           <w:p>
             <w:pPr>
+              <w:keepNext/>
+              <w:keepLines/>
               <w:spacing w:after="0"/>
             </w:pPr>
             <w:r>
@@ -888,6 +942,8 @@
           </w:tcPr>
           <w:p>
             <w:pPr>
+              <w:keepNext/>
+              <w:keepLines/>
               <w:spacing w:after="0"/>
             </w:pPr>
             <w:r>
@@ -900,12 +956,17 @@
         </w:tc>
       </w:tr>
       <w:tr>
+        <w:trPr>
+          <w:cantSplit/>
+        </w:trPr>
         <w:tc>
           <w:tcPr>
             <w:tcW w:type="dxa" w:w="4703"/>
           </w:tcPr>
           <w:p>
             <w:pPr>
+              <w:keepNext/>
+              <w:keepLines/>
               <w:spacing w:after="0"/>
             </w:pPr>
             <w:r>
@@ -922,6 +983,8 @@
           </w:tcPr>
           <w:p>
             <w:pPr>
+              <w:keepNext/>
+              <w:keepLines/>
               <w:spacing w:after="0"/>
             </w:pPr>
             <w:r>
@@ -934,12 +997,17 @@
         </w:tc>
       </w:tr>
       <w:tr>
+        <w:trPr>
+          <w:cantSplit/>
+        </w:trPr>
         <w:tc>
           <w:tcPr>
             <w:tcW w:type="dxa" w:w="4703"/>
           </w:tcPr>
           <w:p>
             <w:pPr>
+              <w:keepNext w:val="0"/>
+              <w:keepLines/>
               <w:spacing w:after="0"/>
             </w:pPr>
             <w:r>
@@ -956,6 +1024,8 @@
           </w:tcPr>
           <w:p>
             <w:pPr>
+              <w:keepNext w:val="0"/>
+              <w:keepLines/>
               <w:spacing w:after="0"/>
             </w:pPr>
             <w:r>

</xml_diff>

<commit_message>
Co-arrendatarios: varias personas por contrato
Se envía una cédula por persona (hasta 4). Desde la segunda, el bot pregunta si
es otro arrendatario o reemplaza al principal; dos fotos seguidas se encolan.
En el contrato todos aparecen en el encabezado, se obligan solidariamente y
firman; las notificaciones siguen a nombre del principal. Se pueden quitar
desde Corregir, los ocupantes no pueden ser menos que los arrendatarios y la
renovación los conserva (los contratos guardados antes funcionan igual).

Co-Authored-By: Claude Opus 5.5 <noreply@anthropic.com>
</commit_message>
<xml_diff>
--- a/templates/contrato-arrendamiento.docx
+++ b/templates/contrato-arrendamiento.docx
@@ -20,7 +20,7 @@
         <w:jc w:val="both"/>
       </w:pPr>
       <w:r>
-        <w:t>MARIO A. ROJAS RODELO, con domicilio en la ciudad de BOGOTÁ, identificado con cédula de ciudadanía No. 80.101.225, quien obra en nombre propio y que para efectos de este contrato se denominará “EL ARRENDADOR”, por una parte, y por la otra, {arrendatario_nombre}, identificado con {arrendatario_identificacion}, quien para efectos de este contrato obra en nombre propio y se denominará EL ARRENDATARIO, manifestaron que han decidido celebrar un contrato de arrendamiento de bien inmueble destinado a vivienda, en adelante el “Contrato”, el cual se rige por la Ley 820 de 2003 y por las siguientes cláusulas:</w:t>
+        <w:t>MARIO A. ROJAS RODELO, con domicilio en la ciudad de BOGOTÁ, identificado con cédula de ciudadanía No. 80.101.225, quien obra en nombre propio y que para efectos de este contrato se denominará “EL ARRENDADOR”, por una parte, y por la otra, {arrendatarios_texto} EL ARRENDATARIO, manifestaron que han decidido celebrar un contrato de arrendamiento de bien inmueble destinado a vivienda, en adelante el “Contrato”, el cual se rige por la Ley 820 de 2003 y por las siguientes cláusulas:</w:t>
       </w:r>
     </w:p>
     <w:p>
@@ -1038,6 +1038,89 @@
         </w:tc>
       </w:tr>
     </w:tbl>
+    <w:p>
+      <w:pPr>
+        <w:keepNext/>
+        <w:jc w:val="both"/>
+      </w:pPr>
+      <w:r>
+        <w:t>{#coarrendatarios}</w:t>
+      </w:r>
+    </w:p>
+    <w:p>
+      <w:pPr>
+        <w:keepNext/>
+        <w:spacing w:after="0"/>
+        <w:jc w:val="center"/>
+      </w:pPr>
+    </w:p>
+    <w:p>
+      <w:pPr>
+        <w:keepNext/>
+        <w:spacing w:after="0"/>
+        <w:jc w:val="center"/>
+      </w:pPr>
+    </w:p>
+    <w:p>
+      <w:pPr>
+        <w:keepNext/>
+        <w:spacing w:after="0"/>
+        <w:jc w:val="center"/>
+      </w:pPr>
+      <w:r>
+        <w:rPr>
+          <w:b w:val="0"/>
+        </w:rPr>
+        <w:t>______________________________</w:t>
+      </w:r>
+    </w:p>
+    <w:p>
+      <w:pPr>
+        <w:keepNext/>
+        <w:spacing w:after="0"/>
+        <w:jc w:val="center"/>
+      </w:pPr>
+      <w:r>
+        <w:rPr>
+          <w:b/>
+        </w:rPr>
+        <w:t>EL ARRENDATARIO</w:t>
+      </w:r>
+    </w:p>
+    <w:p>
+      <w:pPr>
+        <w:keepNext/>
+        <w:spacing w:after="0"/>
+        <w:jc w:val="center"/>
+      </w:pPr>
+      <w:r>
+        <w:rPr>
+          <w:b w:val="0"/>
+        </w:rPr>
+        <w:t>{nombre}</w:t>
+      </w:r>
+    </w:p>
+    <w:p>
+      <w:pPr>
+        <w:keepNext/>
+        <w:spacing w:after="0"/>
+        <w:jc w:val="center"/>
+      </w:pPr>
+      <w:r>
+        <w:rPr>
+          <w:b w:val="0"/>
+        </w:rPr>
+        <w:t>{documento_firma}</w:t>
+      </w:r>
+    </w:p>
+    <w:p>
+      <w:pPr>
+        <w:jc w:val="both"/>
+      </w:pPr>
+      <w:r>
+        <w:t>{/coarrendatarios}</w:t>
+      </w:r>
+    </w:p>
     <w:sectPr>
       <w:pgSz w:w="12240" w:h="15840"/>
       <w:pgMar w:top="1417" w:right="1417" w:bottom="1417" w:left="1417" w:header="720" w:footer="720" w:gutter="0"/>

</xml_diff>

<commit_message>
Plantilla: las firmas van con la cláusula de notificaciones y "Página X de Y"
Al no caber en la página, el bloque de firmas pasaba completo a una hoja nueva
sin texto del contrato, dejando la anterior medio vacía. Ahora la cláusula
Décima Novena (notificaciones), el cierre y las firmas van encadenados, así la
hoja de firmas siempre lleva texto del contrato. Además, cada página lleva
"Página X de Y" al pie para que no se pueda cambiar una hoja sin que se note.

Co-Authored-By: Claude Opus 5.5 <noreply@anthropic.com>
</commit_message>
<xml_diff>
--- a/templates/contrato-arrendamiento.docx
+++ b/templates/contrato-arrendamiento.docx
@@ -621,6 +621,7 @@
     </w:p>
     <w:p>
       <w:pPr>
+        <w:keepNext/>
         <w:jc w:val="both"/>
       </w:pPr>
       <w:r>
@@ -808,7 +809,7 @@
           </w:tcPr>
           <w:p>
             <w:pPr>
-              <w:keepNext w:val="0"/>
+              <w:keepNext/>
               <w:keepLines/>
               <w:spacing w:after="40"/>
             </w:pPr>
@@ -827,7 +828,7 @@
           </w:tcPr>
           <w:p>
             <w:pPr>
-              <w:keepNext w:val="0"/>
+              <w:keepNext/>
               <w:keepLines/>
               <w:spacing w:after="40"/>
             </w:pPr>
@@ -842,7 +843,11 @@
         </w:tc>
       </w:tr>
     </w:tbl>
-    <w:p/>
+    <w:p>
+      <w:pPr>
+        <w:keepNext/>
+      </w:pPr>
+    </w:p>
     <w:p>
       <w:pPr>
         <w:keepNext/>
@@ -1122,6 +1127,7 @@
       </w:r>
     </w:p>
     <w:sectPr>
+      <w:footerReference w:type="default" r:id="rId9"/>
       <w:pgSz w:w="12240" w:h="15840"/>
       <w:pgMar w:top="1417" w:right="1417" w:bottom="1417" w:left="1417" w:header="720" w:footer="720" w:gutter="0"/>
       <w:cols w:space="720"/>
@@ -1129,6 +1135,39 @@
     </w:sectPr>
   </w:body>
 </w:document>
+</file>
+
+<file path=word/footer1.xml><?xml version="1.0" encoding="utf-8"?>
+<w:ftr xmlns:m="http://schemas.openxmlformats.org/officeDocument/2006/math" xmlns:mc="http://schemas.openxmlformats.org/markup-compatibility/2006" xmlns:mo="http://schemas.microsoft.com/office/mac/office/2008/main" xmlns:mv="urn:schemas-microsoft-com:mac:vml" xmlns:o="urn:schemas-microsoft-com:office:office" xmlns:r="http://schemas.openxmlformats.org/officeDocument/2006/relationships" xmlns:v="urn:schemas-microsoft-com:vml" xmlns:w10="urn:schemas-microsoft-com:office:word" xmlns:w14="http://schemas.microsoft.com/office/word/2010/wordml" xmlns:w="http://schemas.openxmlformats.org/wordprocessingml/2006/main" xmlns:wne="http://schemas.microsoft.com/office/word/2006/wordml" xmlns:wp14="http://schemas.microsoft.com/office/word/2010/wordprocessingDrawing" xmlns:wp="http://schemas.openxmlformats.org/drawingml/2006/wordprocessingDrawing" xmlns:wpc="http://schemas.microsoft.com/office/word/2010/wordprocessingCanvas" xmlns:wpg="http://schemas.microsoft.com/office/word/2010/wordprocessingGroup" xmlns:wpi="http://schemas.microsoft.com/office/word/2010/wordprocessingInk" xmlns:wps="http://schemas.microsoft.com/office/word/2010/wordprocessingShape" mc:Ignorable="w14 wp14">
+  <w:p>
+    <w:pPr>
+      <w:pStyle w:val="Footer"/>
+      <w:jc w:val="center"/>
+    </w:pPr>
+    <w:r>
+      <w:rPr>
+        <w:sz w:val="16"/>
+      </w:rPr>
+      <w:t xml:space="preserve">Página </w:t>
+    </w:r>
+    <w:fldSimple w:instr="PAGE">
+      <w:r>
+        <w:t>1</w:t>
+      </w:r>
+    </w:fldSimple>
+    <w:r>
+      <w:rPr>
+        <w:sz w:val="16"/>
+      </w:rPr>
+      <w:t xml:space="preserve"> de </w:t>
+    </w:r>
+    <w:fldSimple w:instr="NUMPAGES">
+      <w:r>
+        <w:t>1</w:t>
+      </w:r>
+    </w:fldSimple>
+  </w:p>
+</w:ftr>
 </file>
 
 <file path=word/numbering.xml><?xml version="1.0" encoding="utf-8"?>

</xml_diff>